<commit_message>
fix(essay-exam): place department and teacher signatures on answer sheets
</commit_message>
<xml_diff>
--- a/public/samples/essay-exam/Đe_dieu_duong_unique.docx
+++ b/public/samples/essay-exam/Đe_dieu_duong_unique.docx
@@ -7744,6 +7744,90 @@
         </w:tc>
       </w:tr>
     </w:tbl>
+    <w:p>
+      <w:pPr>
+        <w:spacing w:before="60" w:after="0"/>
+      </w:pPr>
+    </w:p>
+    <w:tbl>
+      <w:tblPr>
+        <w:tblW w:w="0" w:type="auto"/>
+        <w:tblBorders>
+          <w:top w:val="nil"/>
+          <w:left w:val="nil"/>
+          <w:bottom w:val="nil"/>
+          <w:right w:val="nil"/>
+          <w:insideH w:val="nil"/>
+          <w:insideV w:val="nil"/>
+        </w:tblBorders>
+      </w:tblPr>
+      <w:tblGrid>
+        <w:gridCol w:w="4500"/>
+        <w:gridCol w:w="4500"/>
+      </w:tblGrid>
+      <w:tr>
+        <w:tc>
+          <w:tcPr>
+            <w:tcW w:w="4500" w:type="dxa"/>
+            <w:vAlign w:val="top"/>
+          </w:tcPr>
+          <w:p>
+            <w:pPr>
+              <w:jc w:val="center"/>
+            </w:pPr>
+            <w:r>
+              <w:rPr>
+                <w:b/>
+              </w:rPr>
+              <w:t>CHỦ NHIỆM KHOA</w:t>
+            </w:r>
+          </w:p>
+          <w:p>
+            <w:pPr>
+              <w:jc w:val="center"/>
+            </w:pPr>
+            <w:r>
+              <w:t>(Ký, ghi rõ họ tên)</w:t>
+            </w:r>
+          </w:p>
+          <w:p>
+            <w:pPr>
+              <w:spacing w:before="250"/>
+            </w:pPr>
+          </w:p>
+        </w:tc>
+        <w:tc>
+          <w:tcPr>
+            <w:tcW w:w="4500" w:type="dxa"/>
+            <w:vAlign w:val="top"/>
+          </w:tcPr>
+          <w:p>
+            <w:pPr>
+              <w:jc w:val="center"/>
+            </w:pPr>
+            <w:r>
+              <w:rPr>
+                <w:b/>
+              </w:rPr>
+              <w:t>GIÁO VIÊN</w:t>
+            </w:r>
+          </w:p>
+          <w:p>
+            <w:pPr>
+              <w:jc w:val="center"/>
+            </w:pPr>
+            <w:r>
+              <w:t>(Ký, ghi rõ họ tên)</w:t>
+            </w:r>
+          </w:p>
+          <w:p>
+            <w:pPr>
+              <w:spacing w:before="250"/>
+            </w:pPr>
+          </w:p>
+        </w:tc>
+      </w:tr>
+    </w:tbl>
     <w:sectPr>
       <w:pgSz w:w="11906" w:h="16838" w:orient="portrait"/>
       <w:pgMar w:top="1134" w:right="1134" w:bottom="1134" w:left="1134" w:header="708" w:footer="708" w:gutter="0"/>

</xml_diff>